<commit_message>
docs: alinea el guion del video 3 del modulo 1 con el mazo y lo humaniza
</commit_message>
<xml_diff>
--- a/docs/capacitacion/guion youtube/modulo-1-el-problema-y-las-bases/video-3-capas-como-aprende-una-red-y-cierre/modulo-1-video-3-capas-como-aprende-una-red-y-cierre-natural.docx
+++ b/docs/capacitacion/guion youtube/modulo-1-el-problema-y-las-bases/video-3-capas-como-aprende-una-red-y-cierre/modulo-1-video-3-capas-como-aprende-una-red-y-cierre-natural.docx
@@ -124,12 +124,12 @@
     </w:p>
     <w:p>
       <w:r>
-        <w:t>Ahora la neurona de salida. Recibe las respuestas de la capa anterior: tres y cero. Tiene los pesos dos y uno, y un sesgo de menos uno. Multiplica tres por dos, que son seis, y cero por uno, que es cero. Suma seis. Le resta el sesgo, uno, y queda cinco. Esa es la respuesta de la red.</w:t>
+        <w:t>Ahora la neurona de salida. Recibe las respuestas de la capa anterior: tres y cero. Tiene los pesos dos y uno, y un sesgo de menos uno. Multiplica tres por dos, que son seis, y cero por uno, que es cero. Suma seis. Le resta el sesgo, uno, y queda cinco. Esa es la respuesta de la red. Si el segundo peso de la primera neurona fuera tres y no uno, la salida sería trece y no cinco.</w:t>
       </w:r>
     </w:p>
     <w:p>
       <w:r>
-        <w:t>Eso es todo. Cuatro multiplicaciones en la capa intermedia, dos más en la salida, unas sumas y una regla de activación. Ahora imaginen esto con millones de neuronas, en decenas de capas. El tipo de operación es el mismo; solo cambia la cantidad, y esa cantidad permite que la red capture patrones muy sutiles.</w:t>
+        <w:t>Eso es todo. Cuatro multiplicaciones en la capa intermedia, dos más en la salida, unas sumas y una regla de activación. Ahora imaginen esto con millones de neuronas, en decenas de capas. El tipo de operación es el mismo; solo cambia la cantidad, y esa cantidad permite que la red capture patrones muy sutiles. Entrenar es buscar los valores de todos los pesos que dan la respuesta correcta.</w:t>
       </w:r>
     </w:p>
     <w:p>
@@ -171,6 +171,11 @@
     <w:p>
       <w:r>
         <w:t>Dicho de otro modo, la profundidad permite construir ideas complejas a partir de ideas más simples, y por eso el aprendizaje profundo funciona tan bien con datos que tienen estructura, como las imágenes.</w:t>
+      </w:r>
+    </w:p>
+    <w:p>
+      <w:r>
+        <w:t>Con una sola capa habría que describir la casa directo desde los píxeles, con un número enorme de neuronas. Pero más capas no siempre es mejor: cada capa agrega pesos que ajustar, y con pocos ejemplos una red muy profunda aprende de memoria.</w:t>
       </w:r>
     </w:p>
     <w:p>
@@ -242,7 +247,7 @@
     </w:p>
     <w:p>
       <w:r>
-        <w:t>Para entrenar la red hace falta, como dijimos, un conjunto de imágenes con la respuesta correcta. Esa respuesta no existe sola. Alguien la tiene que crear. En nuestro caso, una persona abre cada imagen en una herramienta de anotación y, para cada cabeza, dibuja su contorno, punto por punto, con el cursor. Es un trabajo lento y exigente.</w:t>
+        <w:t>Para entrenar la red hace falta, como dijimos, un conjunto de imágenes con la respuesta correcta. Esa respuesta no existe sola. Alguien la tiene que crear. En nuestro caso, una persona abre cada imagen en una herramienta de anotación y, para cada cabeza, dibuja su contorno, punto por punto, con el cursor. Es un trabajo lento y exigente. Una imagen suele traer unos ciento cincuenta contornos, así que con solo diez imágenes son más de mil quinientos dibujados a mano. Para eso usamos una herramienta de anotación llamada CVAT, sin publicar los datos. En la foto de la diapositiva se ve un ejemplo con otro tipo de célula: cada núcleo lleva su contorno dibujado a mano.</w:t>
       </w:r>
     </w:p>
     <w:p>
@@ -283,12 +288,17 @@
     </w:p>
     <w:p>
       <w:r>
-        <w:t>En unas formas de aprendizaje, a la computadora se le dan ejemplos con la respuesta correcta incluida. A eso se le llama aprendizaje supervisado, porque alguien supervisa: ya dijo cuál es la respuesta. Un ejemplo es darle mil imágenes, cada una con la etiqueta perro o gato, para que aprenda a distinguirlos. El nuestro es de este tipo: le damos imágenes con el contorno de cada cabeza ya dibujado.</w:t>
+        <w:t>En unas formas de aprendizaje, a la computadora se le dan ejemplos con la respuesta correcta incluida. A eso se le llama aprendizaje supervisado, porque alguien supervisa: ya dijo cuál es la respuesta. Un ejemplo es darle mil imágenes, cada una con la etiqueta perro o gato, para que aprenda a distinguirlos. En la diapositiva se ven dos de esas imágenes con su etiqueta. El nuestro es de este tipo: le damos imágenes con el contorno de cada cabeza ya dibujado.</w:t>
       </w:r>
     </w:p>
     <w:p>
       <w:r>
         <w:t>En otras formas no se da la respuesta. A eso se le llama aprendizaje no supervisado. La computadora recibe datos sin etiquetas y tiene que encontrar por sí misma estructura en ellos, por ejemplo agrupar imágenes parecidas sin que nadie le haya dicho cuáles son las categorías. Es útil cuando se quiere explorar datos, pero no sirve para una tarea tan precisa como trazar el contorno de una célula.</w:t>
+      </w:r>
+    </w:p>
+    <w:p>
+      <w:r>
+        <w:t>Existe una tercera forma, el aprendizaje por refuerzo: la computadora prueba acciones y recibe premios o castigos, como en un juego o al controlar un robot.</w:t>
       </w:r>
     </w:p>
     <w:p>
@@ -334,7 +344,7 @@
     </w:p>
     <w:p>
       <w:r>
-        <w:t>En una red como la nuestra, que debe encontrar cabezas y trazar su contorno, la pérdida combina varias medidas: si la red acertó en que ahí había una cabeza, qué tan bien quedó su ubicación y qué tanto coincide el contorno que dibujó la red con el que dibujó la persona. Todas se suman en un solo número, y ese es el que se intenta reducir.</w:t>
+        <w:t>En una red como la nuestra, que debe encontrar cabezas y trazar su contorno, la pérdida combina varias medidas: si la red acertó en que ahí había una cabeza, qué tan bien quedó su ubicación y qué tanto coincide el contorno que dibujó la red con el que dibujó la persona. Todas se suman en un solo número, y ese es el que se intenta reducir. Durante el entrenamiento, la curva de la pérdida empieza alta, baja deprisa y después baja cada vez más despacio hasta estabilizarse, como se ve en la gráfica.</w:t>
       </w:r>
     </w:p>
     <w:p>
@@ -447,7 +457,7 @@
           <w:i/>
           <w:sz w:val="20"/>
         </w:rPr>
-        <w:t>Idea central: La retropropagación calcula cuánto contribuyó cada peso al error, yendo hacia atrás desde la salida, capa por capa. Se parece a revisar una cadena de montaje de atrás hacia adelante.</w:t>
+        <w:t>Idea central: La retropropagación calcula cuánto contribuyó cada peso al error, yendo hacia atrás desde la salida, capa por capa. Se parece a revisar una cadena de montaje de atrás hacia adelante, o los tiros fallados de Batalla naval.</w:t>
       </w:r>
     </w:p>
     <w:p>
@@ -458,6 +468,11 @@
     <w:p>
       <w:r>
         <w:t>Veamos la idea con una analogía más cercana. Imaginen una cadena de montaje con varias estaciones, y al final sale un producto defectuoso. Nadie sabe en cuál estación se cometió el error. Una persona revisa el producto y, caminando hacia atrás, va preguntando: ¿esta estación lo hizo bien? ¿La anterior? Así identifica cuánto contribuyó cada una al defecto, y le pide a cada una que corrija lo suyo, un poco, en la dirección correcta.</w:t>
+      </w:r>
+    </w:p>
+    <w:p>
+      <w:r>
+        <w:t>Otra forma de verlo es el juego de Batalla naval. Al principio la red dispara casi al azar, como quien dispara a ciegas. Las piezas blancas, que marcan los tiros fallados, ayudan a ver de dónde viene el error, como en el tablero de la diapositiva. La retropropagación recorre el camino de vuelta, desde donde el error es más grande, para encontrar su origen.</w:t>
       </w:r>
     </w:p>
     <w:p>
@@ -544,12 +559,17 @@
     </w:p>
     <w:p>
       <w:r>
-        <w:t>En un entrenamiento hay varias cosas que dependen del azar. Los pesos iniciales se eligen al azar. El orden en que se presentan las imágenes se baraja en cada época. Y algunas técnicas que se usan para que la red generalice mejor también incluyen azar, como alterar ligeramente las imágenes en cada pasada.</w:t>
+        <w:t>En un entrenamiento hay varias cosas que dependen del azar, como la tirada de un dado, que sale distinta cada vez. Los pesos iniciales se eligen al azar. El orden en que se presentan las imágenes se baraja en cada época. Y algunas técnicas que se usan para que la red generalice mejor también incluyen azar, como alterar ligeramente las imágenes en cada pasada.</w:t>
       </w:r>
     </w:p>
     <w:p>
       <w:r>
-        <w:t>Las computadoras no generan azar de verdad. Generan secuencias de números que lo parecen, a partir de un valor inicial que se llama semilla. Con la misma semilla, la secuencia es siempre la misma. Y eso es útil: si fijamos la semilla, el entrenamiento se vuelve repetible. Con los mismos datos, las mismas decisiones y la misma semilla, otra persona obtiene el mismo resultado.</w:t>
+        <w:t>Las computadoras no generan azar de verdad. Generan secuencias de números que lo parecen, a partir de un valor inicial que se llama semilla. Con la misma semilla, la secuencia es siempre la misma. Y eso es útil: si fijamos la semilla, el entrenamiento se vuelve repetible. Con los mismos datos, las mismas decisiones y la misma semilla, otra persona obtiene el mismo resultado. Por eso el cuaderno de entrenamiento guarda las semillas.</w:t>
+      </w:r>
+    </w:p>
+    <w:p>
+      <w:r>
+        <w:t>Hay un matiz: algunas operaciones de las tarjetas gráficas no son estrictamente deterministas, así que lo que se busca es que los resultados sean comparables.</w:t>
       </w:r>
     </w:p>
     <w:p>
@@ -600,11 +620,6 @@
     </w:p>
     <w:p>
       <w:r>
-        <w:t>Con estas ideas ya tenemos las bases de qué es una red neuronal y cómo aprende.</w:t>
-      </w:r>
-    </w:p>
-    <w:p>
-      <w:r>
         <w:rPr>
           <w:b/>
           <w:color w:val="1F4E9A"/>
@@ -642,6 +657,11 @@
     <w:p>
       <w:r>
         <w:t>El tercero son los errores de dos tipos. Puede marcar algo que no es una cabeza, como una mancha o un trozo de cola. Y puede dejar sin marcar una cabeza que sí está. Los segundos son más difíciles de notar, porque no hay contorno que mirar. Por eso conviene mirar la imagen entera y no solo lo marcado.</w:t>
+      </w:r>
+    </w:p>
+    <w:p>
+      <w:r>
+        <w:t>Además, el modelo refleja sus datos: con pocos ejemplos de una situación, la maneja peor, y mejorarlo exige más ejemplos, variados y bien anotados. Que funcione en unas imágenes no garantiza que funcione en todas, así que hay que verificar con imágenes propias. Y cada resultado del sitio trae la imagen marcada, justo para comprobar si los contornos tienen sentido.</w:t>
       </w:r>
     </w:p>
     <w:p>
@@ -688,7 +708,7 @@
           <w:i/>
           <w:sz w:val="20"/>
         </w:rPr>
-        <w:t>Idea central: En este módulo vimos qué es una red neuronal y cómo aprende. En el siguiente módulo vemos cómo mira una imagen una red convolucional y cómo se aprovecha una red entrenada para otra cosa; después, el sitio funcionando, y al final, datos, entrenamiento y despliegue.</w:t>
+        <w:t>Idea central: En este módulo vimos qué es una red neuronal y cómo aprende. En el siguiente módulo vemos cómo mira una imagen una red convolucional, cómo se aprovecha una red entrenada para otra cosa y cómo se preparan los datos y se entrena; después, el sistema y su código, y al final, el entrenamiento en código y el despliegue.</w:t>
       </w:r>
     </w:p>
     <w:p>
@@ -698,12 +718,12 @@
     </w:p>
     <w:p>
       <w:r>
-        <w:t>Y termino con una pregunta que seguramente ya se hicieron: ¿cómo sabe el sistema dónde hay un espermatozoide? De eso trata el siguiente módulo: cómo mira una imagen una red como la nuestra, y por qué una red entrenada para otra cosa nos sirve para contar espermatozoides.</w:t>
+        <w:t>Y termino con una pregunta que seguramente ya se hicieron: ¿cómo sabe el sistema dónde hay un espermatozoide? De eso trata el siguiente módulo: cómo mira una imagen una red como la nuestra, por qué una red entrenada para otra cosa nos sirve para contar espermatozoides, y cómo se preparan los datos y se entrena.</w:t>
       </w:r>
     </w:p>
     <w:p>
       <w:r>
-        <w:t>Luego viene el sistema funcionando, con el sitio, y por último los datos, el entrenamiento y el despliegue en la nube. Gracias por acompañarme en este módulo.</w:t>
+        <w:t>Luego viene el sistema y su código, y por último el entrenamiento en código y el despliegue en la nube. Gracias por acompañarme en este módulo.</w:t>
       </w:r>
     </w:p>
     <w:sectPr>

</xml_diff>